<commit_message>
Fill in individual contribution tables
Co-Authored-By: Claude Sonnet 5.5 <noreply@anthropic.com>
Claude-Session: https://claude.ai/code/session_01PxJg5Kdj3DxQWxYBUBsz7B
</commit_message>
<xml_diff>
--- a/submission/Presentation_Guide_and_QA.docx
+++ b/submission/Presentation_Guide_and_QA.docx
@@ -92,7 +92,7 @@
           <w:i w:val="0"/>
           <w:sz w:val="22"/>
         </w:rPr>
-        <w:t>Team: Pavitran VC  [Reg. No. - fill]  |  [Team member 2 - fill]  |  [Team member 3 - fill]</w:t>
+        <w:t>Team: Pavitran VC [Reg. No.]  |  [Teammate name] [Reg. No.]</w:t>
       </w:r>
     </w:p>
     <w:p>
@@ -1614,7 +1614,7 @@
           <w:b w:val="0"/>
           <w:i w:val="0"/>
         </w:rPr>
-        <w:t>A: State your own part first, then the others, using the table in the documents. Mention one specific thing each person built or tested.</w:t>
+        <w:t>A: State your own part first, then the others, using the table in the documents (you did all the coding; your teammate did documentation and demo preparation). Mention one specific thing each person built or tested.</w:t>
       </w:r>
     </w:p>
     <w:p>

</xml_diff>

<commit_message>
Use generic name and registration number placeholders
Co-Authored-By: Claude Sonnet 5.5 <noreply@anthropic.com>
Claude-Session: https://claude.ai/code/session_01PxJg5Kdj3DxQWxYBUBsz7B
</commit_message>
<xml_diff>
--- a/submission/Presentation_Guide_and_QA.docx
+++ b/submission/Presentation_Guide_and_QA.docx
@@ -92,7 +92,7 @@
           <w:i w:val="0"/>
           <w:sz w:val="22"/>
         </w:rPr>
-        <w:t>Team: Pavitran VC [Reg. No.]  |  [Teammate name] [Reg. No.]</w:t>
+        <w:t>Team: [Your Name] [Reg. No.]  |  [Teammate Name] [Reg. No.]</w:t>
       </w:r>
     </w:p>
     <w:p>
@@ -106,7 +106,7 @@
           <w:i w:val="0"/>
           <w:sz w:val="22"/>
         </w:rPr>
-        <w:t>Guide: [Guide name, designation - fill]</w:t>
+        <w:t>Guide: [Guide Name, Designation]</w:t>
       </w:r>
     </w:p>
     <w:p>

</xml_diff>

<commit_message>
submission: update test counts and bug-audit summary after the hardening fixes
Review 2 is left unchanged (it describes the earlier version).

Co-Authored-By: Claude Sonnet 5.5 <noreply@anthropic.com>
Claude-Session: https://claude.ai/code/session_015fS3ThmfsSxmYP7DLEhG2y
</commit_message>
<xml_diff>
--- a/submission/Presentation_Guide_and_QA.docx
+++ b/submission/Presentation_Guide_and_QA.docx
@@ -379,7 +379,7 @@
               <w:rPr>
                 <w:sz w:val="19"/>
               </w:rPr>
-              <w:t>158 tests / 24 binaries</w:t>
+              <w:t>171 tests / 26 binaries</w:t>
             </w:r>
           </w:p>
         </w:tc>
@@ -2048,7 +2048,7 @@
           <w:b w:val="0"/>
           <w:i w:val="0"/>
         </w:rPr>
-        <w:t>A: Four real bugs found by deliberately attacking our own inputs: an empty datagram stopped the programs, an invalid packet could steal a sequence number, SO_REUSEADDR let two processes share one UDP port, and the RS decoder returned uninitialised data on failure. A test file was also hidden by .gitignore so make test failed on a fresh clone. We fixed everything and the sanitizers now report nothing.</w:t>
+        <w:t>A: Four real bugs found by deliberately attacking our own inputs: an empty datagram stopped the programs, an invalid packet could steal a sequence number, SO_REUSEADDR let two processes share one UDP port, and the RS decoder returned uninitialised data on failure. A test file was also hidden by .gitignore so make test failed on a fresh clone. We fixed everything and the sanitizers now report nothing. A later audit of every module, with each decoder fuzzed under ASan and UBSan, found and fixed more: truncated datagrams passing as packets, a stack overflow on oversized sizes in the FEC encoder and decoder, an out-of-bounds table read, a division by zero and a wrapping retry counter. Each fix has a regression test, and a few low-severity follow-ups are documented.</w:t>
       </w:r>
     </w:p>
     <w:p>

</xml_diff>